<commit_message>
Preparación de sincronización para prueba con base de datos wordpress.
</commit_message>
<xml_diff>
--- a/Documentos/sincronizaciónWordpress.docx
+++ b/Documentos/sincronizaciónWordpress.docx
@@ -13,6 +13,27 @@
           <w:rStyle w:val="bzpyqfadein"/>
         </w:rPr>
         <w:t>estas son las variables y estructuras que deberías sincronizar con WordPress para que el usuario conserve su progreso.</w:t>
+      </w:r>
+    </w:p>
+    <w:p>
+      <w:pPr>
+        <w:pStyle w:val="Prrafodelista"/>
+        <w:numPr>
+          <w:ilvl w:val="0"/>
+          <w:numId w:val="12"/>
+        </w:numPr>
+        <w:rPr>
+          <w:rStyle w:val="bzpyqfadein"/>
+        </w:rPr>
+      </w:pPr>
+      <w:r>
+        <w:rPr>
+          <w:rStyle w:val="bzpyqfadein"/>
+        </w:rPr>
+        <w:t xml:space="preserve">Sistema de chat global en wordpress: </w:t>
+      </w:r>
+      <w:r>
+        <w:t>Better Messages</w:t>
       </w:r>
     </w:p>
     <w:p>
@@ -79,7 +100,6 @@
           <w14:ligatures w14:val="none"/>
         </w:rPr>
       </w:pPr>
-      <w:proofErr w:type="spellStart"/>
       <w:r>
         <w:rPr>
           <w:rFonts w:ascii="Courier New" w:eastAsia="Times New Roman" w:hAnsi="Courier New" w:cs="Courier New"/>
@@ -91,7 +111,6 @@
         </w:rPr>
         <w:t>username</w:t>
       </w:r>
-      <w:proofErr w:type="spellEnd"/>
     </w:p>
     <w:p>
       <w:pPr>
@@ -175,7 +194,6 @@
           <w14:ligatures w14:val="none"/>
         </w:rPr>
       </w:pPr>
-      <w:proofErr w:type="spellStart"/>
       <w:r>
         <w:rPr>
           <w:rFonts w:ascii="Courier New" w:eastAsia="Times New Roman" w:hAnsi="Courier New" w:cs="Courier New"/>
@@ -187,7 +205,6 @@
         </w:rPr>
         <w:t>profession</w:t>
       </w:r>
-      <w:proofErr w:type="spellEnd"/>
     </w:p>
     <w:p>
       <w:pPr>
@@ -224,7 +241,6 @@
           <w14:ligatures w14:val="none"/>
         </w:rPr>
       </w:pPr>
-      <w:proofErr w:type="spellStart"/>
       <w:r>
         <w:rPr>
           <w:rFonts w:ascii="Courier New" w:eastAsia="Times New Roman" w:hAnsi="Courier New" w:cs="Courier New"/>
@@ -236,7 +252,6 @@
         </w:rPr>
         <w:t>IQuser</w:t>
       </w:r>
-      <w:proofErr w:type="spellEnd"/>
     </w:p>
     <w:p>
       <w:pPr>
@@ -273,7 +288,6 @@
           <w14:ligatures w14:val="none"/>
         </w:rPr>
       </w:pPr>
-      <w:proofErr w:type="spellStart"/>
       <w:r>
         <w:rPr>
           <w:rFonts w:ascii="Courier New" w:eastAsia="Times New Roman" w:hAnsi="Courier New" w:cs="Courier New"/>
@@ -285,7 +299,6 @@
         </w:rPr>
         <w:t>cosmonedas</w:t>
       </w:r>
-      <w:proofErr w:type="spellEnd"/>
     </w:p>
     <w:p>
       <w:pPr>
@@ -322,7 +335,6 @@
           <w14:ligatures w14:val="none"/>
         </w:rPr>
       </w:pPr>
-      <w:proofErr w:type="spellStart"/>
       <w:r>
         <w:rPr>
           <w:rFonts w:ascii="Courier New" w:eastAsia="Times New Roman" w:hAnsi="Courier New" w:cs="Courier New"/>
@@ -334,7 +346,6 @@
         </w:rPr>
         <w:t>pdv</w:t>
       </w:r>
-      <w:proofErr w:type="spellEnd"/>
     </w:p>
     <w:p>
       <w:pPr>
@@ -380,7 +391,6 @@
           <w14:ligatures w14:val="none"/>
         </w:rPr>
       </w:pPr>
-      <w:proofErr w:type="spellStart"/>
       <w:r>
         <w:rPr>
           <w:rFonts w:ascii="Courier New" w:eastAsia="Times New Roman" w:hAnsi="Courier New" w:cs="Courier New"/>
@@ -394,7 +404,6 @@
         </w:rPr>
         <w:t>username</w:t>
       </w:r>
-      <w:proofErr w:type="spellEnd"/>
       <w:r>
         <w:rPr>
           <w:rFonts w:ascii="Times New Roman" w:eastAsia="Times New Roman" w:hAnsi="Times New Roman" w:cs="Times New Roman"/>
@@ -445,10 +454,16 @@
           <w:lang w:eastAsia="es-CO"/>
           <w14:ligatures w14:val="none"/>
         </w:rPr>
-        <w:t xml:space="preserve">: </w:t>
-      </w:r>
-      <w:proofErr w:type="spellStart"/>
-      <w:r>
+        <w:t>: sprite activo del avatar</w:t>
+      </w:r>
+    </w:p>
+    <w:p>
+      <w:pPr>
+        <w:numPr>
+          <w:ilvl w:val="0"/>
+          <w:numId w:val="1"/>
+        </w:numPr>
+        <w:spacing w:before="100" w:beforeAutospacing="1" w:after="100" w:afterAutospacing="1" w:line="240" w:lineRule="auto"/>
         <w:rPr>
           <w:rFonts w:ascii="Times New Roman" w:eastAsia="Times New Roman" w:hAnsi="Times New Roman" w:cs="Times New Roman"/>
           <w:kern w:val="0"/>
@@ -457,38 +472,7 @@
           <w:lang w:eastAsia="es-CO"/>
           <w14:ligatures w14:val="none"/>
         </w:rPr>
-        <w:t>sprite</w:t>
-      </w:r>
-      <w:proofErr w:type="spellEnd"/>
-      <w:r>
-        <w:rPr>
-          <w:rFonts w:ascii="Times New Roman" w:eastAsia="Times New Roman" w:hAnsi="Times New Roman" w:cs="Times New Roman"/>
-          <w:kern w:val="0"/>
-          <w:sz w:val="24"/>
-          <w:szCs w:val="24"/>
-          <w:lang w:eastAsia="es-CO"/>
-          <w14:ligatures w14:val="none"/>
-        </w:rPr>
-        <w:t xml:space="preserve"> activo del avatar</w:t>
-      </w:r>
-    </w:p>
-    <w:p>
-      <w:pPr>
-        <w:numPr>
-          <w:ilvl w:val="0"/>
-          <w:numId w:val="1"/>
-        </w:numPr>
-        <w:spacing w:before="100" w:beforeAutospacing="1" w:after="100" w:afterAutospacing="1" w:line="240" w:lineRule="auto"/>
-        <w:rPr>
-          <w:rFonts w:ascii="Times New Roman" w:eastAsia="Times New Roman" w:hAnsi="Times New Roman" w:cs="Times New Roman"/>
-          <w:kern w:val="0"/>
-          <w:sz w:val="24"/>
-          <w:szCs w:val="24"/>
-          <w:lang w:eastAsia="es-CO"/>
-          <w14:ligatures w14:val="none"/>
-        </w:rPr>
-      </w:pPr>
-      <w:proofErr w:type="spellStart"/>
+      </w:pPr>
       <w:r>
         <w:rPr>
           <w:rFonts w:ascii="Courier New" w:eastAsia="Times New Roman" w:hAnsi="Courier New" w:cs="Courier New"/>
@@ -502,7 +486,6 @@
         </w:rPr>
         <w:t>profession</w:t>
       </w:r>
-      <w:proofErr w:type="spellEnd"/>
       <w:r>
         <w:rPr>
           <w:rFonts w:ascii="Times New Roman" w:eastAsia="Times New Roman" w:hAnsi="Times New Roman" w:cs="Times New Roman"/>
@@ -544,7 +527,6 @@
           <w14:ligatures w14:val="none"/>
         </w:rPr>
       </w:pPr>
-      <w:proofErr w:type="spellStart"/>
       <w:r>
         <w:rPr>
           <w:rFonts w:ascii="Courier New" w:eastAsia="Times New Roman" w:hAnsi="Courier New" w:cs="Courier New"/>
@@ -558,7 +540,6 @@
         </w:rPr>
         <w:t>IQuser</w:t>
       </w:r>
-      <w:proofErr w:type="spellEnd"/>
       <w:r>
         <w:rPr>
           <w:rFonts w:ascii="Times New Roman" w:eastAsia="Times New Roman" w:hAnsi="Times New Roman" w:cs="Times New Roman"/>
@@ -600,7 +581,6 @@
           <w14:ligatures w14:val="none"/>
         </w:rPr>
       </w:pPr>
-      <w:proofErr w:type="spellStart"/>
       <w:r>
         <w:rPr>
           <w:rFonts w:ascii="Courier New" w:eastAsia="Times New Roman" w:hAnsi="Courier New" w:cs="Courier New"/>
@@ -614,7 +594,6 @@
         </w:rPr>
         <w:t>cosmonedas</w:t>
       </w:r>
-      <w:proofErr w:type="spellEnd"/>
       <w:r>
         <w:rPr>
           <w:rFonts w:ascii="Times New Roman" w:eastAsia="Times New Roman" w:hAnsi="Times New Roman" w:cs="Times New Roman"/>
@@ -656,7 +635,6 @@
           <w14:ligatures w14:val="none"/>
         </w:rPr>
       </w:pPr>
-      <w:proofErr w:type="spellStart"/>
       <w:r>
         <w:rPr>
           <w:rFonts w:ascii="Courier New" w:eastAsia="Times New Roman" w:hAnsi="Courier New" w:cs="Courier New"/>
@@ -670,7 +648,6 @@
         </w:rPr>
         <w:t>pdv</w:t>
       </w:r>
-      <w:proofErr w:type="spellEnd"/>
       <w:r>
         <w:rPr>
           <w:rFonts w:ascii="Times New Roman" w:eastAsia="Times New Roman" w:hAnsi="Times New Roman" w:cs="Times New Roman"/>
@@ -732,46 +709,120 @@
           <w:numId w:val="8"/>
         </w:numPr>
       </w:pPr>
-      <w:proofErr w:type="spellStart"/>
-      <w:r>
-        <w:t>localStorage.getItem</w:t>
-      </w:r>
-      <w:proofErr w:type="spellEnd"/>
-      <w:r>
-        <w:t>("</w:t>
-      </w:r>
-      <w:proofErr w:type="spellStart"/>
-      <w:r>
+      <w:r>
+        <w:t>localStorage.getItem("avatarId")</w:t>
+      </w:r>
+    </w:p>
+    <w:p>
+      <w:pPr>
+        <w:pStyle w:val="Prrafodelista"/>
+        <w:numPr>
+          <w:ilvl w:val="0"/>
+          <w:numId w:val="8"/>
+        </w:numPr>
+      </w:pPr>
+      <w:r>
+        <w:t>localStorage.getItem("gender")</w:t>
+      </w:r>
+    </w:p>
+    <w:p>
+      <w:pPr>
+        <w:pStyle w:val="NormalWeb"/>
+      </w:pPr>
+      <w:r>
+        <w:rPr>
+          <w:rStyle w:val="bzpyqfadein"/>
+        </w:rPr>
+        <w:t>Entonces también conviene guardar:</w:t>
+      </w:r>
+    </w:p>
+    <w:p>
+      <w:pPr>
+        <w:pStyle w:val="HTMLconformatoprevio"/>
+        <w:numPr>
+          <w:ilvl w:val="0"/>
+          <w:numId w:val="9"/>
+        </w:numPr>
+        <w:rPr>
+          <w:rStyle w:val="CdigoHTML"/>
+        </w:rPr>
+      </w:pPr>
+      <w:r>
+        <w:rPr>
+          <w:rStyle w:val="CdigoHTML"/>
+        </w:rPr>
         <w:t>avatarId</w:t>
       </w:r>
-      <w:proofErr w:type="spellEnd"/>
-      <w:r>
-        <w:t>")</w:t>
-      </w:r>
-    </w:p>
-    <w:p>
-      <w:pPr>
-        <w:pStyle w:val="Prrafodelista"/>
-        <w:numPr>
-          <w:ilvl w:val="0"/>
-          <w:numId w:val="8"/>
-        </w:numPr>
-      </w:pPr>
-      <w:proofErr w:type="spellStart"/>
-      <w:r>
-        <w:t>localStorage.getItem</w:t>
-      </w:r>
-      <w:proofErr w:type="spellEnd"/>
-      <w:r>
-        <w:t>("</w:t>
-      </w:r>
-      <w:proofErr w:type="spellStart"/>
-      <w:r>
+    </w:p>
+    <w:p>
+      <w:pPr>
+        <w:pStyle w:val="HTMLconformatoprevio"/>
+        <w:numPr>
+          <w:ilvl w:val="0"/>
+          <w:numId w:val="9"/>
+        </w:numPr>
+        <w:rPr>
+          <w:rStyle w:val="CdigoHTML"/>
+        </w:rPr>
+      </w:pPr>
+      <w:r>
+        <w:rPr>
+          <w:rStyle w:val="CdigoHTML"/>
+        </w:rPr>
         <w:t>gender</w:t>
       </w:r>
-      <w:proofErr w:type="spellEnd"/>
-      <w:r>
-        <w:t>")</w:t>
+    </w:p>
+    <w:p>
+      <w:pPr>
+        <w:pStyle w:val="NormalWeb"/>
+      </w:pPr>
+      <w:r>
+        <w:rPr>
+          <w:rStyle w:val="bzpyqfadein"/>
+        </w:rPr>
+        <w:t>porque:</w:t>
+      </w:r>
+    </w:p>
+    <w:p>
+      <w:pPr>
+        <w:pStyle w:val="NormalWeb"/>
+        <w:numPr>
+          <w:ilvl w:val="0"/>
+          <w:numId w:val="2"/>
+        </w:numPr>
+      </w:pPr>
+      <w:r>
+        <w:rPr>
+          <w:rStyle w:val="CdigoHTML"/>
+        </w:rPr>
+        <w:t>avatarId</w:t>
+      </w:r>
+      <w:r>
+        <w:rPr>
+          <w:rStyle w:val="bzpyqfadein"/>
+        </w:rPr>
+        <w:t xml:space="preserve"> te sirve para reconstruir la miniatura correcta en UI</w:t>
+      </w:r>
+    </w:p>
+    <w:p>
+      <w:pPr>
+        <w:pStyle w:val="NormalWeb"/>
+        <w:numPr>
+          <w:ilvl w:val="0"/>
+          <w:numId w:val="2"/>
+        </w:numPr>
+      </w:pPr>
+      <w:r>
+        <w:rPr>
+          <w:rStyle w:val="CdigoHTML"/>
+        </w:rPr>
+        <w:t>gender</w:t>
+      </w:r>
+      <w:r>
+        <w:rPr>
+          <w:rStyle w:val="bzpyqfadein"/>
+        </w:rPr>
+        <w:t xml:space="preserve"> te sirve para restaurar la selección del personaje</w:t>
       </w:r>
     </w:p>
     <w:p>
@@ -790,40 +841,36 @@
         <w:pStyle w:val="HTMLconformatoprevio"/>
         <w:numPr>
           <w:ilvl w:val="0"/>
-          <w:numId w:val="9"/>
-        </w:numPr>
-        <w:rPr>
-          <w:rStyle w:val="CdigoHTML"/>
-        </w:rPr>
-      </w:pPr>
-      <w:proofErr w:type="spellStart"/>
+          <w:numId w:val="10"/>
+        </w:numPr>
+        <w:rPr>
+          <w:rStyle w:val="CdigoHTML"/>
+        </w:rPr>
+      </w:pPr>
       <w:r>
         <w:rPr>
           <w:rStyle w:val="CdigoHTML"/>
         </w:rPr>
         <w:t>avatarId</w:t>
       </w:r>
-      <w:proofErr w:type="spellEnd"/>
     </w:p>
     <w:p>
       <w:pPr>
         <w:pStyle w:val="HTMLconformatoprevio"/>
         <w:numPr>
           <w:ilvl w:val="0"/>
-          <w:numId w:val="9"/>
-        </w:numPr>
-        <w:rPr>
-          <w:rStyle w:val="CdigoHTML"/>
-        </w:rPr>
-      </w:pPr>
-      <w:proofErr w:type="spellStart"/>
+          <w:numId w:val="10"/>
+        </w:numPr>
+        <w:rPr>
+          <w:rStyle w:val="CdigoHTML"/>
+        </w:rPr>
+      </w:pPr>
       <w:r>
         <w:rPr>
           <w:rStyle w:val="CdigoHTML"/>
         </w:rPr>
         <w:t>gender</w:t>
       </w:r>
-      <w:proofErr w:type="spellEnd"/>
     </w:p>
     <w:p>
       <w:pPr>
@@ -841,17 +888,15 @@
         <w:pStyle w:val="NormalWeb"/>
         <w:numPr>
           <w:ilvl w:val="0"/>
-          <w:numId w:val="2"/>
-        </w:numPr>
-      </w:pPr>
-      <w:proofErr w:type="spellStart"/>
+          <w:numId w:val="3"/>
+        </w:numPr>
+      </w:pPr>
       <w:r>
         <w:rPr>
           <w:rStyle w:val="CdigoHTML"/>
         </w:rPr>
         <w:t>avatarId</w:t>
       </w:r>
-      <w:proofErr w:type="spellEnd"/>
       <w:r>
         <w:rPr>
           <w:rStyle w:val="bzpyqfadein"/>
@@ -864,125 +909,15 @@
         <w:pStyle w:val="NormalWeb"/>
         <w:numPr>
           <w:ilvl w:val="0"/>
-          <w:numId w:val="2"/>
-        </w:numPr>
-      </w:pPr>
-      <w:proofErr w:type="spellStart"/>
+          <w:numId w:val="3"/>
+        </w:numPr>
+      </w:pPr>
       <w:r>
         <w:rPr>
           <w:rStyle w:val="CdigoHTML"/>
         </w:rPr>
         <w:t>gender</w:t>
       </w:r>
-      <w:proofErr w:type="spellEnd"/>
-      <w:r>
-        <w:rPr>
-          <w:rStyle w:val="bzpyqfadein"/>
-        </w:rPr>
-        <w:t xml:space="preserve"> te sirve para restaurar la selección del personaje</w:t>
-      </w:r>
-    </w:p>
-    <w:p>
-      <w:pPr>
-        <w:pStyle w:val="NormalWeb"/>
-      </w:pPr>
-      <w:r>
-        <w:rPr>
-          <w:rStyle w:val="bzpyqfadein"/>
-        </w:rPr>
-        <w:t>Entonces también conviene guardar:</w:t>
-      </w:r>
-    </w:p>
-    <w:p>
-      <w:pPr>
-        <w:pStyle w:val="HTMLconformatoprevio"/>
-        <w:numPr>
-          <w:ilvl w:val="0"/>
-          <w:numId w:val="10"/>
-        </w:numPr>
-        <w:rPr>
-          <w:rStyle w:val="CdigoHTML"/>
-        </w:rPr>
-      </w:pPr>
-      <w:proofErr w:type="spellStart"/>
-      <w:r>
-        <w:rPr>
-          <w:rStyle w:val="CdigoHTML"/>
-        </w:rPr>
-        <w:t>avatarId</w:t>
-      </w:r>
-      <w:proofErr w:type="spellEnd"/>
-    </w:p>
-    <w:p>
-      <w:pPr>
-        <w:pStyle w:val="HTMLconformatoprevio"/>
-        <w:numPr>
-          <w:ilvl w:val="0"/>
-          <w:numId w:val="10"/>
-        </w:numPr>
-        <w:rPr>
-          <w:rStyle w:val="CdigoHTML"/>
-        </w:rPr>
-      </w:pPr>
-      <w:proofErr w:type="spellStart"/>
-      <w:r>
-        <w:rPr>
-          <w:rStyle w:val="CdigoHTML"/>
-        </w:rPr>
-        <w:t>gender</w:t>
-      </w:r>
-      <w:proofErr w:type="spellEnd"/>
-    </w:p>
-    <w:p>
-      <w:pPr>
-        <w:pStyle w:val="NormalWeb"/>
-      </w:pPr>
-      <w:r>
-        <w:rPr>
-          <w:rStyle w:val="bzpyqfadein"/>
-        </w:rPr>
-        <w:t>porque:</w:t>
-      </w:r>
-    </w:p>
-    <w:p>
-      <w:pPr>
-        <w:pStyle w:val="NormalWeb"/>
-        <w:numPr>
-          <w:ilvl w:val="0"/>
-          <w:numId w:val="3"/>
-        </w:numPr>
-      </w:pPr>
-      <w:proofErr w:type="spellStart"/>
-      <w:r>
-        <w:rPr>
-          <w:rStyle w:val="CdigoHTML"/>
-        </w:rPr>
-        <w:t>avatarId</w:t>
-      </w:r>
-      <w:proofErr w:type="spellEnd"/>
-      <w:r>
-        <w:rPr>
-          <w:rStyle w:val="bzpyqfadein"/>
-        </w:rPr>
-        <w:t xml:space="preserve"> te sirve para reconstruir la miniatura correcta en UI</w:t>
-      </w:r>
-    </w:p>
-    <w:p>
-      <w:pPr>
-        <w:pStyle w:val="NormalWeb"/>
-        <w:numPr>
-          <w:ilvl w:val="0"/>
-          <w:numId w:val="3"/>
-        </w:numPr>
-      </w:pPr>
-      <w:proofErr w:type="spellStart"/>
-      <w:r>
-        <w:rPr>
-          <w:rStyle w:val="CdigoHTML"/>
-        </w:rPr>
-        <w:t>gender</w:t>
-      </w:r>
-      <w:proofErr w:type="spellEnd"/>
       <w:r>
         <w:rPr>
           <w:rStyle w:val="bzpyqfadein"/>
@@ -1010,14 +945,12 @@
           <w:numId w:val="3"/>
         </w:numPr>
       </w:pPr>
-      <w:proofErr w:type="spellStart"/>
       <w:r>
         <w:rPr>
           <w:rStyle w:val="CdigoHTML"/>
         </w:rPr>
         <w:t>currentMapId</w:t>
       </w:r>
-      <w:proofErr w:type="spellEnd"/>
     </w:p>
     <w:p>
       <w:pPr>
@@ -1072,8 +1005,6 @@
           <w:rStyle w:val="CdigoHTML"/>
         </w:rPr>
       </w:pPr>
-      <w:proofErr w:type="spellStart"/>
-      <w:proofErr w:type="gramStart"/>
       <w:r>
         <w:rPr>
           <w:rStyle w:val="hljs-variable"/>
@@ -1092,8 +1023,6 @@
         </w:rPr>
         <w:t>inventarioUser</w:t>
       </w:r>
-      <w:proofErr w:type="spellEnd"/>
-      <w:proofErr w:type="gramEnd"/>
     </w:p>
     <w:p>
       <w:pPr>
@@ -1106,8 +1035,6 @@
           <w:rStyle w:val="CdigoHTML"/>
         </w:rPr>
       </w:pPr>
-      <w:proofErr w:type="spellStart"/>
-      <w:proofErr w:type="gramStart"/>
       <w:r>
         <w:rPr>
           <w:rStyle w:val="hljs-variable"/>
@@ -1126,8 +1053,6 @@
         </w:rPr>
         <w:t>equipSlots</w:t>
       </w:r>
-      <w:proofErr w:type="spellEnd"/>
-      <w:proofErr w:type="gramEnd"/>
     </w:p>
     <w:p>
       <w:pPr>
@@ -1140,14 +1065,12 @@
           <w:rStyle w:val="CdigoHTML"/>
         </w:rPr>
       </w:pPr>
-      <w:proofErr w:type="spellStart"/>
       <w:r>
         <w:rPr>
           <w:rStyle w:val="CdigoHTML"/>
         </w:rPr>
         <w:t>combinacionSlots</w:t>
       </w:r>
-      <w:proofErr w:type="spellEnd"/>
     </w:p>
     <w:p>
       <w:pPr>
@@ -1160,14 +1083,12 @@
           <w:rStyle w:val="CdigoHTML"/>
         </w:rPr>
       </w:pPr>
-      <w:proofErr w:type="spellStart"/>
       <w:r>
         <w:rPr>
           <w:rStyle w:val="CdigoHTML"/>
         </w:rPr>
         <w:t>combinacionResultado</w:t>
       </w:r>
-      <w:proofErr w:type="spellEnd"/>
     </w:p>
     <w:p>
       <w:pPr>
@@ -1188,16 +1109,12 @@
           <w:numId w:val="4"/>
         </w:numPr>
       </w:pPr>
-      <w:proofErr w:type="spellStart"/>
-      <w:proofErr w:type="gramStart"/>
       <w:r>
         <w:rPr>
           <w:rStyle w:val="CdigoHTML"/>
         </w:rPr>
         <w:t>window.inventarioUser</w:t>
       </w:r>
-      <w:proofErr w:type="spellEnd"/>
-      <w:proofErr w:type="gramEnd"/>
       <w:r>
         <w:rPr>
           <w:rStyle w:val="bzpyqfadein"/>
@@ -1213,35 +1130,17 @@
           <w:numId w:val="4"/>
         </w:numPr>
       </w:pPr>
-      <w:proofErr w:type="spellStart"/>
-      <w:proofErr w:type="gramStart"/>
       <w:r>
         <w:rPr>
           <w:rStyle w:val="CdigoHTML"/>
         </w:rPr>
         <w:t>window.equipSlots</w:t>
       </w:r>
-      <w:proofErr w:type="spellEnd"/>
-      <w:proofErr w:type="gramEnd"/>
-      <w:r>
-        <w:rPr>
-          <w:rStyle w:val="bzpyqfadein"/>
-        </w:rPr>
-        <w:t xml:space="preserve">: </w:t>
-      </w:r>
-      <w:proofErr w:type="spellStart"/>
-      <w:r>
-        <w:rPr>
-          <w:rStyle w:val="bzpyqfadein"/>
-        </w:rPr>
-        <w:t>items</w:t>
-      </w:r>
-      <w:proofErr w:type="spellEnd"/>
-      <w:r>
-        <w:rPr>
-          <w:rStyle w:val="bzpyqfadein"/>
-        </w:rPr>
-        <w:t xml:space="preserve"> equipados</w:t>
+      <w:r>
+        <w:rPr>
+          <w:rStyle w:val="bzpyqfadein"/>
+        </w:rPr>
+        <w:t>: items equipados</w:t>
       </w:r>
     </w:p>
     <w:p>
@@ -1252,14 +1151,12 @@
           <w:numId w:val="4"/>
         </w:numPr>
       </w:pPr>
-      <w:proofErr w:type="spellStart"/>
       <w:r>
         <w:rPr>
           <w:rStyle w:val="CdigoHTML"/>
         </w:rPr>
         <w:t>combinacionSlots</w:t>
       </w:r>
-      <w:proofErr w:type="spellEnd"/>
       <w:r>
         <w:rPr>
           <w:rStyle w:val="bzpyqfadein"/>
@@ -1275,58 +1172,28 @@
           <w:numId w:val="4"/>
         </w:numPr>
       </w:pPr>
-      <w:proofErr w:type="spellStart"/>
       <w:r>
         <w:rPr>
           <w:rStyle w:val="CdigoHTML"/>
         </w:rPr>
         <w:t>combinacionResultado</w:t>
       </w:r>
-      <w:proofErr w:type="spellEnd"/>
-      <w:r>
-        <w:rPr>
-          <w:rStyle w:val="bzpyqfadein"/>
-        </w:rPr>
-        <w:t xml:space="preserve">: </w:t>
-      </w:r>
-      <w:proofErr w:type="spellStart"/>
-      <w:r>
-        <w:rPr>
-          <w:rStyle w:val="bzpyqfadein"/>
-        </w:rPr>
-        <w:t>item</w:t>
-      </w:r>
-      <w:proofErr w:type="spellEnd"/>
-      <w:r>
-        <w:rPr>
-          <w:rStyle w:val="bzpyqfadein"/>
-        </w:rPr>
-        <w:t xml:space="preserve"> resultado pendiente de crear</w:t>
-      </w:r>
-    </w:p>
-    <w:p>
-      <w:pPr>
-        <w:pStyle w:val="NormalWeb"/>
-      </w:pPr>
-      <w:r>
-        <w:rPr>
-          <w:rStyle w:val="bzpyqfadein"/>
-        </w:rPr>
-        <w:t xml:space="preserve">Cada </w:t>
-      </w:r>
-      <w:proofErr w:type="spellStart"/>
-      <w:r>
-        <w:rPr>
-          <w:rStyle w:val="bzpyqfadein"/>
-        </w:rPr>
-        <w:t>item</w:t>
-      </w:r>
-      <w:proofErr w:type="spellEnd"/>
-      <w:r>
-        <w:rPr>
-          <w:rStyle w:val="bzpyqfadein"/>
-        </w:rPr>
-        <w:t xml:space="preserve"> debería guardarse con todos sus datos útiles, por ejemplo:</w:t>
+      <w:r>
+        <w:rPr>
+          <w:rStyle w:val="bzpyqfadein"/>
+        </w:rPr>
+        <w:t>: item resultado pendiente de crear</w:t>
+      </w:r>
+    </w:p>
+    <w:p>
+      <w:pPr>
+        <w:pStyle w:val="NormalWeb"/>
+      </w:pPr>
+      <w:r>
+        <w:rPr>
+          <w:rStyle w:val="bzpyqfadein"/>
+        </w:rPr>
+        <w:t>Cada item debería guardarse con todos sus datos útiles, por ejemplo:</w:t>
       </w:r>
     </w:p>
     <w:p>
@@ -1352,14 +1219,12 @@
           <w:numId w:val="5"/>
         </w:numPr>
       </w:pPr>
-      <w:proofErr w:type="spellStart"/>
       <w:r>
         <w:rPr>
           <w:rStyle w:val="CdigoHTML"/>
         </w:rPr>
         <w:t>item_id</w:t>
       </w:r>
-      <w:proofErr w:type="spellEnd"/>
     </w:p>
     <w:p>
       <w:pPr>
@@ -1369,14 +1234,12 @@
           <w:numId w:val="5"/>
         </w:numPr>
       </w:pPr>
-      <w:proofErr w:type="spellStart"/>
       <w:r>
         <w:rPr>
           <w:rStyle w:val="CdigoHTML"/>
         </w:rPr>
         <w:t>nombre_item</w:t>
       </w:r>
-      <w:proofErr w:type="spellEnd"/>
     </w:p>
     <w:p>
       <w:pPr>
@@ -1401,14 +1264,12 @@
           <w:numId w:val="5"/>
         </w:numPr>
       </w:pPr>
-      <w:proofErr w:type="spellStart"/>
       <w:r>
         <w:rPr>
           <w:rStyle w:val="CdigoHTML"/>
         </w:rPr>
         <w:t>tipo_item</w:t>
       </w:r>
-      <w:proofErr w:type="spellEnd"/>
     </w:p>
     <w:p>
       <w:pPr>
@@ -1463,14 +1324,12 @@
           <w:numId w:val="5"/>
         </w:numPr>
       </w:pPr>
-      <w:proofErr w:type="spellStart"/>
       <w:r>
         <w:rPr>
           <w:rStyle w:val="CdigoHTML"/>
         </w:rPr>
         <w:t>usos_maximos</w:t>
       </w:r>
-      <w:proofErr w:type="spellEnd"/>
     </w:p>
     <w:p>
       <w:pPr>
@@ -1480,14 +1339,12 @@
           <w:numId w:val="5"/>
         </w:numPr>
       </w:pPr>
-      <w:proofErr w:type="spellStart"/>
       <w:r>
         <w:rPr>
           <w:rStyle w:val="CdigoHTML"/>
         </w:rPr>
         <w:t>desaparece_al_agotarse</w:t>
       </w:r>
-      <w:proofErr w:type="spellEnd"/>
     </w:p>
     <w:p/>
     <w:p/>
@@ -1534,8 +1391,6 @@
           <w:rStyle w:val="CdigoHTML"/>
         </w:rPr>
       </w:pPr>
-      <w:proofErr w:type="spellStart"/>
-      <w:proofErr w:type="gramStart"/>
       <w:r>
         <w:rPr>
           <w:rStyle w:val="hljs-variable"/>
@@ -1554,8 +1409,6 @@
         </w:rPr>
         <w:t>missionSystem</w:t>
       </w:r>
-      <w:proofErr w:type="spellEnd"/>
-      <w:proofErr w:type="gramEnd"/>
       <w:r>
         <w:rPr>
           <w:rStyle w:val="CdigoHTML"/>
@@ -1576,14 +1429,12 @@
         </w:rPr>
         <w:t xml:space="preserve">  </w:t>
       </w:r>
-      <w:proofErr w:type="spellStart"/>
       <w:r>
         <w:rPr>
           <w:rStyle w:val="hljs-attr"/>
         </w:rPr>
         <w:t>acceptedMissionIds</w:t>
       </w:r>
-      <w:proofErr w:type="spellEnd"/>
       <w:r>
         <w:rPr>
           <w:rStyle w:val="CdigoHTML"/>
@@ -1604,28 +1455,24 @@
         </w:rPr>
         <w:t xml:space="preserve">  </w:t>
       </w:r>
-      <w:proofErr w:type="spellStart"/>
       <w:r>
         <w:rPr>
           <w:rStyle w:val="hljs-attr"/>
         </w:rPr>
         <w:t>activeMissionId</w:t>
       </w:r>
-      <w:proofErr w:type="spellEnd"/>
       <w:r>
         <w:rPr>
           <w:rStyle w:val="CdigoHTML"/>
         </w:rPr>
         <w:t xml:space="preserve">: </w:t>
       </w:r>
-      <w:proofErr w:type="spellStart"/>
       <w:r>
         <w:rPr>
           <w:rStyle w:val="hljs-literal"/>
         </w:rPr>
         <w:t>null</w:t>
       </w:r>
-      <w:proofErr w:type="spellEnd"/>
       <w:r>
         <w:rPr>
           <w:rStyle w:val="CdigoHTML"/>
@@ -1646,14 +1493,12 @@
         </w:rPr>
         <w:t xml:space="preserve">  </w:t>
       </w:r>
-      <w:proofErr w:type="spellStart"/>
       <w:r>
         <w:rPr>
           <w:rStyle w:val="hljs-attr"/>
         </w:rPr>
         <w:t>activeStepIndexByMission</w:t>
       </w:r>
-      <w:proofErr w:type="spellEnd"/>
       <w:r>
         <w:rPr>
           <w:rStyle w:val="CdigoHTML"/>
@@ -1674,14 +1519,12 @@
         </w:rPr>
         <w:t xml:space="preserve">  </w:t>
       </w:r>
-      <w:proofErr w:type="spellStart"/>
       <w:r>
         <w:rPr>
           <w:rStyle w:val="hljs-attr"/>
         </w:rPr>
         <w:t>completedMissionIds</w:t>
       </w:r>
-      <w:proofErr w:type="spellEnd"/>
       <w:r>
         <w:rPr>
           <w:rStyle w:val="CdigoHTML"/>
@@ -1702,14 +1545,12 @@
         </w:rPr>
         <w:t xml:space="preserve">  </w:t>
       </w:r>
-      <w:proofErr w:type="spellStart"/>
       <w:r>
         <w:rPr>
           <w:rStyle w:val="hljs-attr"/>
         </w:rPr>
         <w:t>revealedStepIndexes</w:t>
       </w:r>
-      <w:proofErr w:type="spellEnd"/>
       <w:r>
         <w:rPr>
           <w:rStyle w:val="CdigoHTML"/>
@@ -1730,14 +1571,12 @@
         </w:rPr>
         <w:t xml:space="preserve">  </w:t>
       </w:r>
-      <w:proofErr w:type="spellStart"/>
       <w:r>
         <w:rPr>
           <w:rStyle w:val="hljs-attr"/>
         </w:rPr>
         <w:t>completedSteps</w:t>
       </w:r>
-      <w:proofErr w:type="spellEnd"/>
       <w:r>
         <w:rPr>
           <w:rStyle w:val="CdigoHTML"/>
@@ -1925,14 +1764,12 @@
           <w:rStyle w:val="CdigoHTML"/>
         </w:rPr>
       </w:pPr>
-      <w:proofErr w:type="spellStart"/>
       <w:r>
         <w:rPr>
           <w:rStyle w:val="CdigoHTML"/>
         </w:rPr>
         <w:t>coordenadasMisionsX</w:t>
       </w:r>
-      <w:proofErr w:type="spellEnd"/>
     </w:p>
     <w:p>
       <w:pPr>
@@ -1941,14 +1778,12 @@
           <w:rStyle w:val="CdigoHTML"/>
         </w:rPr>
       </w:pPr>
-      <w:proofErr w:type="spellStart"/>
       <w:r>
         <w:rPr>
           <w:rStyle w:val="CdigoHTML"/>
         </w:rPr>
         <w:t>coordenadasMisionsY</w:t>
       </w:r>
-      <w:proofErr w:type="spellEnd"/>
     </w:p>
     <w:p>
       <w:pPr>
@@ -1957,14 +1792,12 @@
           <w:rStyle w:val="CdigoHTML"/>
         </w:rPr>
       </w:pPr>
-      <w:proofErr w:type="spellStart"/>
       <w:r>
         <w:rPr>
           <w:rStyle w:val="CdigoHTML"/>
         </w:rPr>
         <w:t>coordenadasMisionState</w:t>
       </w:r>
-      <w:proofErr w:type="spellEnd"/>
     </w:p>
     <w:p>
       <w:pPr>
@@ -1979,47 +1812,29 @@
         </w:rPr>
         <w:t xml:space="preserve">No son tan críticas si al cargar vuelves a calcularlas desde </w:t>
       </w:r>
-      <w:proofErr w:type="spellStart"/>
       <w:r>
         <w:rPr>
           <w:rStyle w:val="CdigoHTML"/>
         </w:rPr>
         <w:t>activeMissionId</w:t>
       </w:r>
-      <w:proofErr w:type="spellEnd"/>
       <w:r>
         <w:rPr>
           <w:rStyle w:val="bzpyqfadein"/>
         </w:rPr>
         <w:t xml:space="preserve"> y </w:t>
       </w:r>
-      <w:proofErr w:type="spellStart"/>
       <w:r>
         <w:rPr>
           <w:rStyle w:val="CdigoHTML"/>
         </w:rPr>
         <w:t>activeStepIndexByMission</w:t>
       </w:r>
-      <w:proofErr w:type="spellEnd"/>
-      <w:r>
-        <w:rPr>
-          <w:rStyle w:val="bzpyqfadein"/>
-        </w:rPr>
-        <w:t xml:space="preserve">, pero si quieres restauración inmediata del </w:t>
-      </w:r>
-      <w:proofErr w:type="spellStart"/>
-      <w:r>
-        <w:rPr>
-          <w:rStyle w:val="bzpyqfadein"/>
-        </w:rPr>
-        <w:t>MetaMap</w:t>
-      </w:r>
-      <w:proofErr w:type="spellEnd"/>
-      <w:r>
-        <w:rPr>
-          <w:rStyle w:val="bzpyqfadein"/>
-        </w:rPr>
-        <w:t>, puedes guardarlas.</w:t>
+      <w:r>
+        <w:rPr>
+          <w:rStyle w:val="bzpyqfadein"/>
+        </w:rPr>
+        <w:t>, pero si quieres restauración inmediata del MetaMap, puedes guardarlas.</w:t>
       </w:r>
     </w:p>
     <w:p>
@@ -2522,6 +2337,118 @@
     </w:lvl>
   </w:abstractNum>
   <w:abstractNum w:abstractNumId="3" w15:restartNumberingAfterBreak="0">
+    <w:nsid w:val="20243BDB"/>
+    <w:multiLevelType w:val="hybridMultilevel"/>
+    <w:tmpl w:val="EDA45A6E"/>
+    <w:lvl w:ilvl="0" w:tplc="DA1854A6">
+      <w:numFmt w:val="bullet"/>
+      <w:lvlText w:val="-"/>
+      <w:lvlJc w:val="left"/>
+      <w:pPr>
+        <w:ind w:left="720" w:hanging="360"/>
+      </w:pPr>
+      <w:rPr>
+        <w:rFonts w:ascii="Calibri" w:eastAsiaTheme="minorHAnsi" w:hAnsi="Calibri" w:cs="Calibri" w:hint="default"/>
+      </w:rPr>
+    </w:lvl>
+    <w:lvl w:ilvl="1" w:tplc="240A0003" w:tentative="1">
+      <w:start w:val="1"/>
+      <w:numFmt w:val="bullet"/>
+      <w:lvlText w:val="o"/>
+      <w:lvlJc w:val="left"/>
+      <w:pPr>
+        <w:ind w:left="1440" w:hanging="360"/>
+      </w:pPr>
+      <w:rPr>
+        <w:rFonts w:ascii="Courier New" w:hAnsi="Courier New" w:cs="Courier New" w:hint="default"/>
+      </w:rPr>
+    </w:lvl>
+    <w:lvl w:ilvl="2" w:tplc="240A0005" w:tentative="1">
+      <w:start w:val="1"/>
+      <w:numFmt w:val="bullet"/>
+      <w:lvlText w:val=""/>
+      <w:lvlJc w:val="left"/>
+      <w:pPr>
+        <w:ind w:left="2160" w:hanging="360"/>
+      </w:pPr>
+      <w:rPr>
+        <w:rFonts w:ascii="Wingdings" w:hAnsi="Wingdings" w:hint="default"/>
+      </w:rPr>
+    </w:lvl>
+    <w:lvl w:ilvl="3" w:tplc="240A0001" w:tentative="1">
+      <w:start w:val="1"/>
+      <w:numFmt w:val="bullet"/>
+      <w:lvlText w:val=""/>
+      <w:lvlJc w:val="left"/>
+      <w:pPr>
+        <w:ind w:left="2880" w:hanging="360"/>
+      </w:pPr>
+      <w:rPr>
+        <w:rFonts w:ascii="Symbol" w:hAnsi="Symbol" w:hint="default"/>
+      </w:rPr>
+    </w:lvl>
+    <w:lvl w:ilvl="4" w:tplc="240A0003" w:tentative="1">
+      <w:start w:val="1"/>
+      <w:numFmt w:val="bullet"/>
+      <w:lvlText w:val="o"/>
+      <w:lvlJc w:val="left"/>
+      <w:pPr>
+        <w:ind w:left="3600" w:hanging="360"/>
+      </w:pPr>
+      <w:rPr>
+        <w:rFonts w:ascii="Courier New" w:hAnsi="Courier New" w:cs="Courier New" w:hint="default"/>
+      </w:rPr>
+    </w:lvl>
+    <w:lvl w:ilvl="5" w:tplc="240A0005" w:tentative="1">
+      <w:start w:val="1"/>
+      <w:numFmt w:val="bullet"/>
+      <w:lvlText w:val=""/>
+      <w:lvlJc w:val="left"/>
+      <w:pPr>
+        <w:ind w:left="4320" w:hanging="360"/>
+      </w:pPr>
+      <w:rPr>
+        <w:rFonts w:ascii="Wingdings" w:hAnsi="Wingdings" w:hint="default"/>
+      </w:rPr>
+    </w:lvl>
+    <w:lvl w:ilvl="6" w:tplc="240A0001" w:tentative="1">
+      <w:start w:val="1"/>
+      <w:numFmt w:val="bullet"/>
+      <w:lvlText w:val=""/>
+      <w:lvlJc w:val="left"/>
+      <w:pPr>
+        <w:ind w:left="5040" w:hanging="360"/>
+      </w:pPr>
+      <w:rPr>
+        <w:rFonts w:ascii="Symbol" w:hAnsi="Symbol" w:hint="default"/>
+      </w:rPr>
+    </w:lvl>
+    <w:lvl w:ilvl="7" w:tplc="240A0003" w:tentative="1">
+      <w:start w:val="1"/>
+      <w:numFmt w:val="bullet"/>
+      <w:lvlText w:val="o"/>
+      <w:lvlJc w:val="left"/>
+      <w:pPr>
+        <w:ind w:left="5760" w:hanging="360"/>
+      </w:pPr>
+      <w:rPr>
+        <w:rFonts w:ascii="Courier New" w:hAnsi="Courier New" w:cs="Courier New" w:hint="default"/>
+      </w:rPr>
+    </w:lvl>
+    <w:lvl w:ilvl="8" w:tplc="240A0005" w:tentative="1">
+      <w:start w:val="1"/>
+      <w:numFmt w:val="bullet"/>
+      <w:lvlText w:val=""/>
+      <w:lvlJc w:val="left"/>
+      <w:pPr>
+        <w:ind w:left="6480" w:hanging="360"/>
+      </w:pPr>
+      <w:rPr>
+        <w:rFonts w:ascii="Wingdings" w:hAnsi="Wingdings" w:hint="default"/>
+      </w:rPr>
+    </w:lvl>
+  </w:abstractNum>
+  <w:abstractNum w:abstractNumId="4" w15:restartNumberingAfterBreak="0">
     <w:nsid w:val="20447B84"/>
     <w:multiLevelType w:val="multilevel"/>
     <w:tmpl w:val="7EB68012"/>
@@ -2670,7 +2597,7 @@
       </w:rPr>
     </w:lvl>
   </w:abstractNum>
-  <w:abstractNum w:abstractNumId="4" w15:restartNumberingAfterBreak="0">
+  <w:abstractNum w:abstractNumId="5" w15:restartNumberingAfterBreak="0">
     <w:nsid w:val="21352F27"/>
     <w:multiLevelType w:val="multilevel"/>
     <w:tmpl w:val="6B9A66AE"/>
@@ -2819,7 +2746,7 @@
       </w:rPr>
     </w:lvl>
   </w:abstractNum>
-  <w:abstractNum w:abstractNumId="5" w15:restartNumberingAfterBreak="0">
+  <w:abstractNum w:abstractNumId="6" w15:restartNumberingAfterBreak="0">
     <w:nsid w:val="24F45587"/>
     <w:multiLevelType w:val="multilevel"/>
     <w:tmpl w:val="A450407C"/>
@@ -2968,7 +2895,7 @@
       </w:rPr>
     </w:lvl>
   </w:abstractNum>
-  <w:abstractNum w:abstractNumId="6" w15:restartNumberingAfterBreak="0">
+  <w:abstractNum w:abstractNumId="7" w15:restartNumberingAfterBreak="0">
     <w:nsid w:val="2F323BA8"/>
     <w:multiLevelType w:val="hybridMultilevel"/>
     <w:tmpl w:val="D60290CA"/>
@@ -3081,7 +3008,7 @@
       </w:rPr>
     </w:lvl>
   </w:abstractNum>
-  <w:abstractNum w:abstractNumId="7" w15:restartNumberingAfterBreak="0">
+  <w:abstractNum w:abstractNumId="8" w15:restartNumberingAfterBreak="0">
     <w:nsid w:val="50050CFB"/>
     <w:multiLevelType w:val="multilevel"/>
     <w:tmpl w:val="5CF0F49A"/>
@@ -3230,7 +3157,7 @@
       </w:rPr>
     </w:lvl>
   </w:abstractNum>
-  <w:abstractNum w:abstractNumId="8" w15:restartNumberingAfterBreak="0">
+  <w:abstractNum w:abstractNumId="9" w15:restartNumberingAfterBreak="0">
     <w:nsid w:val="61471E28"/>
     <w:multiLevelType w:val="hybridMultilevel"/>
     <w:tmpl w:val="5A225A7C"/>
@@ -3343,7 +3270,7 @@
       </w:rPr>
     </w:lvl>
   </w:abstractNum>
-  <w:abstractNum w:abstractNumId="9" w15:restartNumberingAfterBreak="0">
+  <w:abstractNum w:abstractNumId="10" w15:restartNumberingAfterBreak="0">
     <w:nsid w:val="678056BC"/>
     <w:multiLevelType w:val="hybridMultilevel"/>
     <w:tmpl w:val="630EA17C"/>
@@ -3456,7 +3383,7 @@
       </w:rPr>
     </w:lvl>
   </w:abstractNum>
-  <w:abstractNum w:abstractNumId="10" w15:restartNumberingAfterBreak="0">
+  <w:abstractNum w:abstractNumId="11" w15:restartNumberingAfterBreak="0">
     <w:nsid w:val="6A0B7EB6"/>
     <w:multiLevelType w:val="multilevel"/>
     <w:tmpl w:val="BDAAD5FA"/>
@@ -3609,34 +3536,37 @@
     <w:abstractNumId w:val="1"/>
   </w:num>
   <w:num w:numId="2" w16cid:durableId="1628196954">
-    <w:abstractNumId w:val="3"/>
+    <w:abstractNumId w:val="4"/>
   </w:num>
   <w:num w:numId="3" w16cid:durableId="991133554">
-    <w:abstractNumId w:val="7"/>
+    <w:abstractNumId w:val="8"/>
   </w:num>
   <w:num w:numId="4" w16cid:durableId="673580774">
-    <w:abstractNumId w:val="10"/>
+    <w:abstractNumId w:val="11"/>
   </w:num>
   <w:num w:numId="5" w16cid:durableId="295063456">
-    <w:abstractNumId w:val="5"/>
+    <w:abstractNumId w:val="6"/>
   </w:num>
   <w:num w:numId="6" w16cid:durableId="1377504731">
-    <w:abstractNumId w:val="4"/>
+    <w:abstractNumId w:val="5"/>
   </w:num>
   <w:num w:numId="7" w16cid:durableId="436753053">
     <w:abstractNumId w:val="0"/>
   </w:num>
   <w:num w:numId="8" w16cid:durableId="1965958994">
-    <w:abstractNumId w:val="6"/>
+    <w:abstractNumId w:val="7"/>
   </w:num>
   <w:num w:numId="9" w16cid:durableId="1024019037">
     <w:abstractNumId w:val="2"/>
   </w:num>
   <w:num w:numId="10" w16cid:durableId="81072207">
-    <w:abstractNumId w:val="8"/>
+    <w:abstractNumId w:val="9"/>
   </w:num>
   <w:num w:numId="11" w16cid:durableId="260529934">
-    <w:abstractNumId w:val="9"/>
+    <w:abstractNumId w:val="10"/>
+  </w:num>
+  <w:num w:numId="12" w16cid:durableId="623124217">
+    <w:abstractNumId w:val="3"/>
   </w:num>
 </w:numbering>
 </file>

</xml_diff>